<commit_message>
jwt authentication for every routes
</commit_message>
<xml_diff>
--- a/Documents/milestone 1/questions and answers.docx
+++ b/Documents/milestone 1/questions and answers.docx
@@ -16,8 +16,13 @@
         </w:rPr>
         <w:t>1</w:t>
       </w:r>
-    </w:p>
-    <w:p>
+      <w:r>
+        <w:rPr>
+          <w:b/>
+          <w:bCs/>
+        </w:rPr>
+        <w:t xml:space="preserve">. </w:t>
+      </w:r>
       <w:r>
         <w:t xml:space="preserve">What problem does a </w:t>
       </w:r>
@@ -49,6 +54,122 @@
         <w:t xml:space="preserve"> because it provides a reliable job queue with features like retries, delayed jobs, and concurrency control. The API simply enqueues jobs and returns a job ID, while workers consume and process jobs asynchronously. This architecture improves reliability and scalability compared to a synchronous API where long tasks would block requests or cause timeouts.</w:t>
       </w:r>
     </w:p>
+    <w:p/>
+    <w:p>
+      <w:pPr>
+        <w:rPr>
+          <w:b/>
+          <w:bCs/>
+        </w:rPr>
+      </w:pPr>
+      <w:r>
+        <w:t xml:space="preserve">2. </w:t>
+      </w:r>
+    </w:p>
+    <w:p>
+      <w:r>
+        <w:t>Why did you separate the system into:</w:t>
+      </w:r>
+    </w:p>
+    <w:p>
+      <w:pPr>
+        <w:numPr>
+          <w:ilvl w:val="0"/>
+          <w:numId w:val="1"/>
+        </w:numPr>
+      </w:pPr>
+      <w:r>
+        <w:t>API service</w:t>
+      </w:r>
+    </w:p>
+    <w:p>
+      <w:pPr>
+        <w:numPr>
+          <w:ilvl w:val="0"/>
+          <w:numId w:val="1"/>
+        </w:numPr>
+      </w:pPr>
+      <w:r>
+        <w:t>worker services</w:t>
+      </w:r>
+    </w:p>
+    <w:p>
+      <w:pPr>
+        <w:numPr>
+          <w:ilvl w:val="0"/>
+          <w:numId w:val="1"/>
+        </w:numPr>
+      </w:pPr>
+      <w:r>
+        <w:t>shared package</w:t>
+      </w:r>
+    </w:p>
+    <w:p>
+      <w:r>
+        <w:t>instead of putting everything in one service?</w:t>
+      </w:r>
+    </w:p>
+    <w:p>
+      <w:pPr>
+        <w:pStyle w:val="ListParagraph"/>
+        <w:numPr>
+          <w:ilvl w:val="0"/>
+          <w:numId w:val="2"/>
+        </w:numPr>
+      </w:pPr>
+      <w:r>
+        <w:t>I separated the system into an API service, worker services, and a shared package to enforce separation of concerns. The API handles HTTP requests, authentication, and job submission, while workers handle asynchronous job processing. This keeps the API lightweight and prevents long-running tasks from blocking requests. Workers can scale independently based on workload, which improves system scalability. The shared package contains common types, entities, and utilities used by both API and workers to maintain consistency and avoid code duplication. This modular architecture improves maintainability, scalability, and fault isolation compared to putting everything in a single service.</w:t>
+      </w:r>
+    </w:p>
+    <w:p>
+      <w:pPr>
+        <w:ind w:left="360"/>
+      </w:pPr>
+      <w:r>
+        <w:t xml:space="preserve">3. </w:t>
+      </w:r>
+      <w:r>
+        <w:t xml:space="preserve">Explain the purpose of </w:t>
+      </w:r>
+      <w:r>
+        <w:rPr>
+          <w:b/>
+          <w:bCs/>
+        </w:rPr>
+        <w:t>Redis</w:t>
+      </w:r>
+      <w:r>
+        <w:t xml:space="preserve"> in your architecture.</w:t>
+      </w:r>
+    </w:p>
+    <w:p>
+      <w:pPr>
+        <w:ind w:left="360"/>
+      </w:pPr>
+      <w:r>
+        <w:t xml:space="preserve">Why is Redis required for </w:t>
+      </w:r>
+      <w:proofErr w:type="spellStart"/>
+      <w:r>
+        <w:t>BullMQ</w:t>
+      </w:r>
+      <w:proofErr w:type="spellEnd"/>
+      <w:r>
+        <w:t>?</w:t>
+      </w:r>
+    </w:p>
+    <w:p>
+      <w:pPr>
+        <w:pStyle w:val="ListParagraph"/>
+        <w:numPr>
+          <w:ilvl w:val="0"/>
+          <w:numId w:val="3"/>
+        </w:numPr>
+      </w:pPr>
+    </w:p>
+    <w:p/>
+    <w:p/>
+    <w:p/>
     <w:sectPr>
       <w:pgSz w:w="12240" w:h="15840"/>
       <w:pgMar w:top="1440" w:right="1440" w:bottom="1440" w:left="1440" w:header="708" w:footer="708" w:gutter="0"/>
@@ -57,6 +178,395 @@
     </w:sectPr>
   </w:body>
 </w:document>
+</file>
+
+<file path=word/numbering.xml><?xml version="1.0" encoding="utf-8"?>
+<w:numbering xmlns:wpc="http://schemas.microsoft.com/office/word/2010/wordprocessingCanvas" xmlns:cx="http://schemas.microsoft.com/office/drawing/2014/chartex" xmlns:cx1="http://schemas.microsoft.com/office/drawing/2015/9/8/chartex" xmlns:cx2="http://schemas.microsoft.com/office/drawing/2015/10/21/chartex" xmlns:cx3="http://schemas.microsoft.com/office/drawing/2016/5/9/chartex" xmlns:cx4="http://schemas.microsoft.com/office/drawing/2016/5/10/chartex" xmlns:cx5="http://schemas.microsoft.com/office/drawing/2016/5/11/chartex" xmlns:cx6="http://schemas.microsoft.com/office/drawing/2016/5/12/chartex" xmlns:cx7="http://schemas.microsoft.com/office/drawing/2016/5/13/chartex" xmlns:cx8="http://schemas.microsoft.com/office/drawing/2016/5/14/chartex" xmlns:mc="http://schemas.openxmlformats.org/markup-compatibility/2006" xmlns:aink="http://schemas.microsoft.com/office/drawing/2016/ink" xmlns:am3d="http://schemas.microsoft.com/office/drawing/2017/model3d" xmlns:o="urn:schemas-microsoft-com:office:office" xmlns:oel="http://schemas.microsoft.com/office/2019/extlst" xmlns:r="http://schemas.openxmlformats.org/officeDocument/2006/relationships" xmlns:m="http://schemas.openxmlformats.org/officeDocument/2006/math" xmlns:v="urn:schemas-microsoft-com:vml" xmlns:wp14="http://schemas.microsoft.com/office/word/2010/wordprocessingDrawing" xmlns:wp="http://schemas.openxmlformats.org/drawingml/2006/wordprocessingDrawing" xmlns:w10="urn:schemas-microsoft-com:office:word" xmlns:w="http://schemas.openxmlformats.org/wordprocessingml/2006/main" xmlns:w14="http://schemas.microsoft.com/office/word/2010/wordml" xmlns:w15="http://schemas.microsoft.com/office/word/2012/wordml" xmlns:w16cex="http://schemas.microsoft.com/office/word/2018/wordml/cex" xmlns:w16cid="http://schemas.microsoft.com/office/word/2016/wordml/cid" xmlns:w16="http://schemas.microsoft.com/office/word/2018/wordml" xmlns:w16du="http://schemas.microsoft.com/office/word/2023/wordml/word16du" xmlns:w16sdtdh="http://schemas.microsoft.com/office/word/2020/wordml/sdtdatahash" xmlns:w16sdtfl="http://schemas.microsoft.com/office/word/2024/wordml/sdtformatlock" xmlns:w16se="http://schemas.microsoft.com/office/word/2015/wordml/symex" xmlns:wpg="http://schemas.microsoft.com/office/word/2010/wordprocessingGroup" xmlns:wpi="http://schemas.microsoft.com/office/word/2010/wordprocessingInk" xmlns:wne="http://schemas.microsoft.com/office/word/2006/wordml" xmlns:wps="http://schemas.microsoft.com/office/word/2010/wordprocessingShape" mc:Ignorable="w14 w15 w16se w16cid w16 w16cex w16sdtdh w16sdtfl w16du wp14">
+  <w:abstractNum w:abstractNumId="0" w15:restartNumberingAfterBreak="0">
+    <w:nsid w:val="17427EB1"/>
+    <w:multiLevelType w:val="multilevel"/>
+    <w:tmpl w:val="4036D9D8"/>
+    <w:lvl w:ilvl="0">
+      <w:start w:val="1"/>
+      <w:numFmt w:val="bullet"/>
+      <w:lvlText w:val=""/>
+      <w:lvlJc w:val="left"/>
+      <w:pPr>
+        <w:tabs>
+          <w:tab w:val="num" w:pos="720"/>
+        </w:tabs>
+        <w:ind w:left="720" w:hanging="360"/>
+      </w:pPr>
+      <w:rPr>
+        <w:rFonts w:ascii="Symbol" w:hAnsi="Symbol" w:hint="default"/>
+        <w:sz w:val="20"/>
+      </w:rPr>
+    </w:lvl>
+    <w:lvl w:ilvl="1" w:tentative="1">
+      <w:start w:val="1"/>
+      <w:numFmt w:val="bullet"/>
+      <w:lvlText w:val="o"/>
+      <w:lvlJc w:val="left"/>
+      <w:pPr>
+        <w:tabs>
+          <w:tab w:val="num" w:pos="1440"/>
+        </w:tabs>
+        <w:ind w:left="1440" w:hanging="360"/>
+      </w:pPr>
+      <w:rPr>
+        <w:rFonts w:ascii="Courier New" w:hAnsi="Courier New" w:hint="default"/>
+        <w:sz w:val="20"/>
+      </w:rPr>
+    </w:lvl>
+    <w:lvl w:ilvl="2" w:tentative="1">
+      <w:start w:val="1"/>
+      <w:numFmt w:val="bullet"/>
+      <w:lvlText w:val=""/>
+      <w:lvlJc w:val="left"/>
+      <w:pPr>
+        <w:tabs>
+          <w:tab w:val="num" w:pos="2160"/>
+        </w:tabs>
+        <w:ind w:left="2160" w:hanging="360"/>
+      </w:pPr>
+      <w:rPr>
+        <w:rFonts w:ascii="Wingdings" w:hAnsi="Wingdings" w:hint="default"/>
+        <w:sz w:val="20"/>
+      </w:rPr>
+    </w:lvl>
+    <w:lvl w:ilvl="3" w:tentative="1">
+      <w:start w:val="1"/>
+      <w:numFmt w:val="bullet"/>
+      <w:lvlText w:val=""/>
+      <w:lvlJc w:val="left"/>
+      <w:pPr>
+        <w:tabs>
+          <w:tab w:val="num" w:pos="2880"/>
+        </w:tabs>
+        <w:ind w:left="2880" w:hanging="360"/>
+      </w:pPr>
+      <w:rPr>
+        <w:rFonts w:ascii="Wingdings" w:hAnsi="Wingdings" w:hint="default"/>
+        <w:sz w:val="20"/>
+      </w:rPr>
+    </w:lvl>
+    <w:lvl w:ilvl="4" w:tentative="1">
+      <w:start w:val="1"/>
+      <w:numFmt w:val="bullet"/>
+      <w:lvlText w:val=""/>
+      <w:lvlJc w:val="left"/>
+      <w:pPr>
+        <w:tabs>
+          <w:tab w:val="num" w:pos="3600"/>
+        </w:tabs>
+        <w:ind w:left="3600" w:hanging="360"/>
+      </w:pPr>
+      <w:rPr>
+        <w:rFonts w:ascii="Wingdings" w:hAnsi="Wingdings" w:hint="default"/>
+        <w:sz w:val="20"/>
+      </w:rPr>
+    </w:lvl>
+    <w:lvl w:ilvl="5" w:tentative="1">
+      <w:start w:val="1"/>
+      <w:numFmt w:val="bullet"/>
+      <w:lvlText w:val=""/>
+      <w:lvlJc w:val="left"/>
+      <w:pPr>
+        <w:tabs>
+          <w:tab w:val="num" w:pos="4320"/>
+        </w:tabs>
+        <w:ind w:left="4320" w:hanging="360"/>
+      </w:pPr>
+      <w:rPr>
+        <w:rFonts w:ascii="Wingdings" w:hAnsi="Wingdings" w:hint="default"/>
+        <w:sz w:val="20"/>
+      </w:rPr>
+    </w:lvl>
+    <w:lvl w:ilvl="6" w:tentative="1">
+      <w:start w:val="1"/>
+      <w:numFmt w:val="bullet"/>
+      <w:lvlText w:val=""/>
+      <w:lvlJc w:val="left"/>
+      <w:pPr>
+        <w:tabs>
+          <w:tab w:val="num" w:pos="5040"/>
+        </w:tabs>
+        <w:ind w:left="5040" w:hanging="360"/>
+      </w:pPr>
+      <w:rPr>
+        <w:rFonts w:ascii="Wingdings" w:hAnsi="Wingdings" w:hint="default"/>
+        <w:sz w:val="20"/>
+      </w:rPr>
+    </w:lvl>
+    <w:lvl w:ilvl="7" w:tentative="1">
+      <w:start w:val="1"/>
+      <w:numFmt w:val="bullet"/>
+      <w:lvlText w:val=""/>
+      <w:lvlJc w:val="left"/>
+      <w:pPr>
+        <w:tabs>
+          <w:tab w:val="num" w:pos="5760"/>
+        </w:tabs>
+        <w:ind w:left="5760" w:hanging="360"/>
+      </w:pPr>
+      <w:rPr>
+        <w:rFonts w:ascii="Wingdings" w:hAnsi="Wingdings" w:hint="default"/>
+        <w:sz w:val="20"/>
+      </w:rPr>
+    </w:lvl>
+    <w:lvl w:ilvl="8" w:tentative="1">
+      <w:start w:val="1"/>
+      <w:numFmt w:val="bullet"/>
+      <w:lvlText w:val=""/>
+      <w:lvlJc w:val="left"/>
+      <w:pPr>
+        <w:tabs>
+          <w:tab w:val="num" w:pos="6480"/>
+        </w:tabs>
+        <w:ind w:left="6480" w:hanging="360"/>
+      </w:pPr>
+      <w:rPr>
+        <w:rFonts w:ascii="Wingdings" w:hAnsi="Wingdings" w:hint="default"/>
+        <w:sz w:val="20"/>
+      </w:rPr>
+    </w:lvl>
+  </w:abstractNum>
+  <w:abstractNum w:abstractNumId="1" w15:restartNumberingAfterBreak="0">
+    <w:nsid w:val="28AA3D84"/>
+    <w:multiLevelType w:val="hybridMultilevel"/>
+    <w:tmpl w:val="7E749A58"/>
+    <w:lvl w:ilvl="0" w:tplc="2550DE08">
+      <w:start w:val="2"/>
+      <w:numFmt w:val="bullet"/>
+      <w:lvlText w:val="&gt;"/>
+      <w:lvlJc w:val="left"/>
+      <w:pPr>
+        <w:ind w:left="720" w:hanging="360"/>
+      </w:pPr>
+      <w:rPr>
+        <w:rFonts w:ascii="Aptos" w:eastAsiaTheme="minorHAnsi" w:hAnsi="Aptos" w:cstheme="minorBidi" w:hint="default"/>
+      </w:rPr>
+    </w:lvl>
+    <w:lvl w:ilvl="1" w:tplc="10090003" w:tentative="1">
+      <w:start w:val="1"/>
+      <w:numFmt w:val="bullet"/>
+      <w:lvlText w:val="o"/>
+      <w:lvlJc w:val="left"/>
+      <w:pPr>
+        <w:ind w:left="1440" w:hanging="360"/>
+      </w:pPr>
+      <w:rPr>
+        <w:rFonts w:ascii="Courier New" w:hAnsi="Courier New" w:cs="Courier New" w:hint="default"/>
+      </w:rPr>
+    </w:lvl>
+    <w:lvl w:ilvl="2" w:tplc="10090005" w:tentative="1">
+      <w:start w:val="1"/>
+      <w:numFmt w:val="bullet"/>
+      <w:lvlText w:val=""/>
+      <w:lvlJc w:val="left"/>
+      <w:pPr>
+        <w:ind w:left="2160" w:hanging="360"/>
+      </w:pPr>
+      <w:rPr>
+        <w:rFonts w:ascii="Wingdings" w:hAnsi="Wingdings" w:hint="default"/>
+      </w:rPr>
+    </w:lvl>
+    <w:lvl w:ilvl="3" w:tplc="10090001" w:tentative="1">
+      <w:start w:val="1"/>
+      <w:numFmt w:val="bullet"/>
+      <w:lvlText w:val=""/>
+      <w:lvlJc w:val="left"/>
+      <w:pPr>
+        <w:ind w:left="2880" w:hanging="360"/>
+      </w:pPr>
+      <w:rPr>
+        <w:rFonts w:ascii="Symbol" w:hAnsi="Symbol" w:hint="default"/>
+      </w:rPr>
+    </w:lvl>
+    <w:lvl w:ilvl="4" w:tplc="10090003" w:tentative="1">
+      <w:start w:val="1"/>
+      <w:numFmt w:val="bullet"/>
+      <w:lvlText w:val="o"/>
+      <w:lvlJc w:val="left"/>
+      <w:pPr>
+        <w:ind w:left="3600" w:hanging="360"/>
+      </w:pPr>
+      <w:rPr>
+        <w:rFonts w:ascii="Courier New" w:hAnsi="Courier New" w:cs="Courier New" w:hint="default"/>
+      </w:rPr>
+    </w:lvl>
+    <w:lvl w:ilvl="5" w:tplc="10090005" w:tentative="1">
+      <w:start w:val="1"/>
+      <w:numFmt w:val="bullet"/>
+      <w:lvlText w:val=""/>
+      <w:lvlJc w:val="left"/>
+      <w:pPr>
+        <w:ind w:left="4320" w:hanging="360"/>
+      </w:pPr>
+      <w:rPr>
+        <w:rFonts w:ascii="Wingdings" w:hAnsi="Wingdings" w:hint="default"/>
+      </w:rPr>
+    </w:lvl>
+    <w:lvl w:ilvl="6" w:tplc="10090001" w:tentative="1">
+      <w:start w:val="1"/>
+      <w:numFmt w:val="bullet"/>
+      <w:lvlText w:val=""/>
+      <w:lvlJc w:val="left"/>
+      <w:pPr>
+        <w:ind w:left="5040" w:hanging="360"/>
+      </w:pPr>
+      <w:rPr>
+        <w:rFonts w:ascii="Symbol" w:hAnsi="Symbol" w:hint="default"/>
+      </w:rPr>
+    </w:lvl>
+    <w:lvl w:ilvl="7" w:tplc="10090003" w:tentative="1">
+      <w:start w:val="1"/>
+      <w:numFmt w:val="bullet"/>
+      <w:lvlText w:val="o"/>
+      <w:lvlJc w:val="left"/>
+      <w:pPr>
+        <w:ind w:left="5760" w:hanging="360"/>
+      </w:pPr>
+      <w:rPr>
+        <w:rFonts w:ascii="Courier New" w:hAnsi="Courier New" w:cs="Courier New" w:hint="default"/>
+      </w:rPr>
+    </w:lvl>
+    <w:lvl w:ilvl="8" w:tplc="10090005" w:tentative="1">
+      <w:start w:val="1"/>
+      <w:numFmt w:val="bullet"/>
+      <w:lvlText w:val=""/>
+      <w:lvlJc w:val="left"/>
+      <w:pPr>
+        <w:ind w:left="6480" w:hanging="360"/>
+      </w:pPr>
+      <w:rPr>
+        <w:rFonts w:ascii="Wingdings" w:hAnsi="Wingdings" w:hint="default"/>
+      </w:rPr>
+    </w:lvl>
+  </w:abstractNum>
+  <w:abstractNum w:abstractNumId="2" w15:restartNumberingAfterBreak="0">
+    <w:nsid w:val="557F2608"/>
+    <w:multiLevelType w:val="hybridMultilevel"/>
+    <w:tmpl w:val="E1122A2E"/>
+    <w:lvl w:ilvl="0" w:tplc="D298B798">
+      <w:start w:val="3"/>
+      <w:numFmt w:val="bullet"/>
+      <w:lvlText w:val=""/>
+      <w:lvlJc w:val="left"/>
+      <w:pPr>
+        <w:ind w:left="720" w:hanging="360"/>
+      </w:pPr>
+      <w:rPr>
+        <w:rFonts w:ascii="Wingdings" w:eastAsiaTheme="minorHAnsi" w:hAnsi="Wingdings" w:cstheme="minorBidi" w:hint="default"/>
+      </w:rPr>
+    </w:lvl>
+    <w:lvl w:ilvl="1" w:tplc="10090003" w:tentative="1">
+      <w:start w:val="1"/>
+      <w:numFmt w:val="bullet"/>
+      <w:lvlText w:val="o"/>
+      <w:lvlJc w:val="left"/>
+      <w:pPr>
+        <w:ind w:left="1440" w:hanging="360"/>
+      </w:pPr>
+      <w:rPr>
+        <w:rFonts w:ascii="Courier New" w:hAnsi="Courier New" w:cs="Courier New" w:hint="default"/>
+      </w:rPr>
+    </w:lvl>
+    <w:lvl w:ilvl="2" w:tplc="10090005" w:tentative="1">
+      <w:start w:val="1"/>
+      <w:numFmt w:val="bullet"/>
+      <w:lvlText w:val=""/>
+      <w:lvlJc w:val="left"/>
+      <w:pPr>
+        <w:ind w:left="2160" w:hanging="360"/>
+      </w:pPr>
+      <w:rPr>
+        <w:rFonts w:ascii="Wingdings" w:hAnsi="Wingdings" w:hint="default"/>
+      </w:rPr>
+    </w:lvl>
+    <w:lvl w:ilvl="3" w:tplc="10090001" w:tentative="1">
+      <w:start w:val="1"/>
+      <w:numFmt w:val="bullet"/>
+      <w:lvlText w:val=""/>
+      <w:lvlJc w:val="left"/>
+      <w:pPr>
+        <w:ind w:left="2880" w:hanging="360"/>
+      </w:pPr>
+      <w:rPr>
+        <w:rFonts w:ascii="Symbol" w:hAnsi="Symbol" w:hint="default"/>
+      </w:rPr>
+    </w:lvl>
+    <w:lvl w:ilvl="4" w:tplc="10090003" w:tentative="1">
+      <w:start w:val="1"/>
+      <w:numFmt w:val="bullet"/>
+      <w:lvlText w:val="o"/>
+      <w:lvlJc w:val="left"/>
+      <w:pPr>
+        <w:ind w:left="3600" w:hanging="360"/>
+      </w:pPr>
+      <w:rPr>
+        <w:rFonts w:ascii="Courier New" w:hAnsi="Courier New" w:cs="Courier New" w:hint="default"/>
+      </w:rPr>
+    </w:lvl>
+    <w:lvl w:ilvl="5" w:tplc="10090005" w:tentative="1">
+      <w:start w:val="1"/>
+      <w:numFmt w:val="bullet"/>
+      <w:lvlText w:val=""/>
+      <w:lvlJc w:val="left"/>
+      <w:pPr>
+        <w:ind w:left="4320" w:hanging="360"/>
+      </w:pPr>
+      <w:rPr>
+        <w:rFonts w:ascii="Wingdings" w:hAnsi="Wingdings" w:hint="default"/>
+      </w:rPr>
+    </w:lvl>
+    <w:lvl w:ilvl="6" w:tplc="10090001" w:tentative="1">
+      <w:start w:val="1"/>
+      <w:numFmt w:val="bullet"/>
+      <w:lvlText w:val=""/>
+      <w:lvlJc w:val="left"/>
+      <w:pPr>
+        <w:ind w:left="5040" w:hanging="360"/>
+      </w:pPr>
+      <w:rPr>
+        <w:rFonts w:ascii="Symbol" w:hAnsi="Symbol" w:hint="default"/>
+      </w:rPr>
+    </w:lvl>
+    <w:lvl w:ilvl="7" w:tplc="10090003" w:tentative="1">
+      <w:start w:val="1"/>
+      <w:numFmt w:val="bullet"/>
+      <w:lvlText w:val="o"/>
+      <w:lvlJc w:val="left"/>
+      <w:pPr>
+        <w:ind w:left="5760" w:hanging="360"/>
+      </w:pPr>
+      <w:rPr>
+        <w:rFonts w:ascii="Courier New" w:hAnsi="Courier New" w:cs="Courier New" w:hint="default"/>
+      </w:rPr>
+    </w:lvl>
+    <w:lvl w:ilvl="8" w:tplc="10090005" w:tentative="1">
+      <w:start w:val="1"/>
+      <w:numFmt w:val="bullet"/>
+      <w:lvlText w:val=""/>
+      <w:lvlJc w:val="left"/>
+      <w:pPr>
+        <w:ind w:left="6480" w:hanging="360"/>
+      </w:pPr>
+      <w:rPr>
+        <w:rFonts w:ascii="Wingdings" w:hAnsi="Wingdings" w:hint="default"/>
+      </w:rPr>
+    </w:lvl>
+  </w:abstractNum>
+  <w:num w:numId="1" w16cid:durableId="1635061934">
+    <w:abstractNumId w:val="0"/>
+  </w:num>
+  <w:num w:numId="2" w16cid:durableId="1129276165">
+    <w:abstractNumId w:val="1"/>
+  </w:num>
+  <w:num w:numId="3" w16cid:durableId="401680609">
+    <w:abstractNumId w:val="2"/>
+  </w:num>
+</w:numbering>
 </file>
 
 <file path=word/styles.xml><?xml version="1.0" encoding="utf-8"?>
@@ -975,6 +1485,17 @@
       <w:spacing w:val="5"/>
     </w:rPr>
   </w:style>
+  <w:style w:type="paragraph" w:styleId="NormalWeb">
+    <w:name w:val="Normal (Web)"/>
+    <w:basedOn w:val="Normal"/>
+    <w:uiPriority w:val="99"/>
+    <w:semiHidden/>
+    <w:unhideWhenUsed/>
+    <w:rsid w:val="000060CB"/>
+    <w:rPr>
+      <w:rFonts w:ascii="Times New Roman" w:hAnsi="Times New Roman" w:cs="Times New Roman"/>
+    </w:rPr>
+  </w:style>
 </w:styles>
 </file>
 

</xml_diff>